<commit_message>
WIP: player leagues and predictions demo fixes
</commit_message>
<xml_diff>
--- a/docs/test/Test Demo 1 - v2 Login y circuito basico.docx
+++ b/docs/test/Test Demo 1 - v2 Login y circuito basico.docx
@@ -1,6 +1,6 @@
 
 <file path=word/document.xml><?xml version="1.0" encoding="utf-8"?>
-<w:document xmlns:wpc="http://schemas.microsoft.com/office/word/2010/wordprocessingCanvas" xmlns:cx="http://schemas.microsoft.com/office/drawing/2014/chartex" xmlns:cx1="http://schemas.microsoft.com/office/drawing/2015/9/8/chartex" xmlns:cx2="http://schemas.microsoft.com/office/drawing/2015/10/21/chartex" xmlns:cx3="http://schemas.microsoft.com/office/drawing/2016/5/9/chartex" xmlns:cx4="http://schemas.microsoft.com/office/drawing/2016/5/10/chartex" xmlns:cx5="http://schemas.microsoft.com/office/drawing/2016/5/11/chartex" xmlns:cx6="http://schemas.microsoft.com/office/drawing/2016/5/12/chartex" xmlns:cx7="http://schemas.microsoft.com/office/drawing/2016/5/13/chartex" xmlns:cx8="http://schemas.microsoft.com/office/drawing/2016/5/14/chartex" xmlns:mc="http://schemas.openxmlformats.org/markup-compatibility/2006" xmlns:aink="http://schemas.microsoft.com/office/drawing/2016/ink" xmlns:am3d="http://schemas.microsoft.com/office/drawing/2017/model3d" xmlns:o="urn:schemas-microsoft-com:office:office" xmlns:r="http://schemas.openxmlformats.org/officeDocument/2006/relationships" xmlns:m="http://schemas.openxmlformats.org/officeDocument/2006/math" xmlns:v="urn:schemas-microsoft-com:vml" xmlns:wp14="http://schemas.microsoft.com/office/word/2010/wordprocessingDrawing" xmlns:wp="http://schemas.openxmlformats.org/drawingml/2006/wordprocessingDrawing" xmlns:w10="urn:schemas-microsoft-com:office:word" xmlns:w="http://schemas.openxmlformats.org/wordprocessingml/2006/main" xmlns:w14="http://schemas.microsoft.com/office/word/2010/wordml" xmlns:w15="http://schemas.microsoft.com/office/word/2012/wordml" xmlns:w16cex="http://schemas.microsoft.com/office/word/2018/wordml/cex" xmlns:w16cid="http://schemas.microsoft.com/office/word/2016/wordml/cid" xmlns:w16="http://schemas.microsoft.com/office/word/2018/wordml" xmlns:w16sdtdh="http://schemas.microsoft.com/office/word/2020/wordml/sdtdatahash" xmlns:w16se="http://schemas.microsoft.com/office/word/2015/wordml/symex" xmlns:wpg="http://schemas.microsoft.com/office/word/2010/wordprocessingGroup" xmlns:wpi="http://schemas.microsoft.com/office/word/2010/wordprocessingInk" xmlns:wne="http://schemas.microsoft.com/office/word/2006/wordml" xmlns:wps="http://schemas.microsoft.com/office/word/2010/wordprocessingShape" mc:Ignorable="w14 w15 w16se w16cid w16 w16cex w16sdtdh wp14">
+<w:document xmlns:wpc="http://schemas.microsoft.com/office/word/2010/wordprocessingCanvas" xmlns:cx="http://schemas.microsoft.com/office/drawing/2014/chartex" xmlns:cx1="http://schemas.microsoft.com/office/drawing/2015/9/8/chartex" xmlns:cx2="http://schemas.microsoft.com/office/drawing/2015/10/21/chartex" xmlns:cx3="http://schemas.microsoft.com/office/drawing/2016/5/9/chartex" xmlns:cx4="http://schemas.microsoft.com/office/drawing/2016/5/10/chartex" xmlns:cx5="http://schemas.microsoft.com/office/drawing/2016/5/11/chartex" xmlns:cx6="http://schemas.microsoft.com/office/drawing/2016/5/12/chartex" xmlns:cx7="http://schemas.microsoft.com/office/drawing/2016/5/13/chartex" xmlns:cx8="http://schemas.microsoft.com/office/drawing/2016/5/14/chartex" xmlns:mc="http://schemas.openxmlformats.org/markup-compatibility/2006" xmlns:aink="http://schemas.microsoft.com/office/drawing/2016/ink" xmlns:am3d="http://schemas.microsoft.com/office/drawing/2017/model3d" xmlns:o="urn:schemas-microsoft-com:office:office" xmlns:oel="http://schemas.microsoft.com/office/2019/extlst" xmlns:r="http://schemas.openxmlformats.org/officeDocument/2006/relationships" xmlns:m="http://schemas.openxmlformats.org/officeDocument/2006/math" xmlns:v="urn:schemas-microsoft-com:vml" xmlns:wp14="http://schemas.microsoft.com/office/word/2010/wordprocessingDrawing" xmlns:wp="http://schemas.openxmlformats.org/drawingml/2006/wordprocessingDrawing" xmlns:w10="urn:schemas-microsoft-com:office:word" xmlns:w="http://schemas.openxmlformats.org/wordprocessingml/2006/main" xmlns:w14="http://schemas.microsoft.com/office/word/2010/wordml" xmlns:w15="http://schemas.microsoft.com/office/word/2012/wordml" xmlns:w16cex="http://schemas.microsoft.com/office/word/2018/wordml/cex" xmlns:w16cid="http://schemas.microsoft.com/office/word/2016/wordml/cid" xmlns:w16="http://schemas.microsoft.com/office/word/2018/wordml" xmlns:w16du="http://schemas.microsoft.com/office/word/2023/wordml/word16du" xmlns:w16sdtdh="http://schemas.microsoft.com/office/word/2020/wordml/sdtdatahash" xmlns:w16se="http://schemas.microsoft.com/office/word/2015/wordml/symex" xmlns:wpg="http://schemas.microsoft.com/office/word/2010/wordprocessingGroup" xmlns:wpi="http://schemas.microsoft.com/office/word/2010/wordprocessingInk" xmlns:wne="http://schemas.microsoft.com/office/word/2006/wordml" xmlns:wps="http://schemas.microsoft.com/office/word/2010/wordprocessingShape" mc:Ignorable="w14 w15 w16se w16cid w16 w16cex w16sdtdh w16du wp14">
   <w:body>
     <w:p>
       <w:r>
@@ -44,15 +44,7 @@
         </w:drawing>
       </w:r>
       <w:r>
-        <w:t xml:space="preserve">1. Poner una imagen de fondo sobre </w:t>
-      </w:r>
-      <w:proofErr w:type="gramStart"/>
-      <w:r>
-        <w:t>futbol ,</w:t>
-      </w:r>
-      <w:proofErr w:type="gramEnd"/>
-      <w:r>
-        <w:t xml:space="preserve"> y usar la paleta de colores de la pantalla principal . que es en tono de </w:t>
+        <w:t xml:space="preserve">1. Poner una imagen de fondo sobre futbol , y usar la paleta de colores de la pantalla principal . que es en tono de </w:t>
       </w:r>
       <w:proofErr w:type="spellStart"/>
       <w:r>
@@ -73,28 +65,23 @@
       </w:r>
       <w:proofErr w:type="spellEnd"/>
       <w:r>
-        <w:t xml:space="preserve"> debería ser mas </w:t>
-      </w:r>
-      <w:proofErr w:type="spellStart"/>
-      <w:proofErr w:type="gramStart"/>
+        <w:t xml:space="preserve"> debería ser </w:t>
+      </w:r>
+      <w:proofErr w:type="spellStart"/>
+      <w:r>
+        <w:t>mas</w:t>
+      </w:r>
+      <w:proofErr w:type="spellEnd"/>
+      <w:r>
+        <w:t xml:space="preserve"> </w:t>
+      </w:r>
+      <w:proofErr w:type="spellStart"/>
       <w:r>
         <w:t>ewspecifico</w:t>
       </w:r>
       <w:proofErr w:type="spellEnd"/>
       <w:r>
-        <w:t xml:space="preserve"> ,</w:t>
-      </w:r>
-      <w:proofErr w:type="gramEnd"/>
-      <w:r>
-        <w:t xml:space="preserve"> si fue error de clave , de usuario o de conexión. Se que suele ponerse uno genérico por </w:t>
-      </w:r>
-      <w:proofErr w:type="gramStart"/>
-      <w:r>
-        <w:t>Seguridad</w:t>
-      </w:r>
-      <w:proofErr w:type="gramEnd"/>
-      <w:r>
-        <w:t xml:space="preserve"> pero no </w:t>
+        <w:t xml:space="preserve"> , si fue error de clave , de usuario o de conexión. Se que suele ponerse uno genérico por Seguridad pero no </w:t>
       </w:r>
       <w:proofErr w:type="spellStart"/>
       <w:r>
@@ -154,15 +141,7 @@
     </w:p>
     <w:p>
       <w:r>
-        <w:t xml:space="preserve">No se ve </w:t>
-      </w:r>
-      <w:proofErr w:type="gramStart"/>
-      <w:r>
-        <w:t>nada .</w:t>
-      </w:r>
-      <w:proofErr w:type="gramEnd"/>
-      <w:r>
-        <w:t xml:space="preserve"> </w:t>
+        <w:t xml:space="preserve">No se ve nada . </w:t>
       </w:r>
     </w:p>
     <w:p>
@@ -226,10 +205,17 @@
     <w:p/>
     <w:p>
       <w:r>
-        <w:t xml:space="preserve">4. MIS LIGAS al ingresar por primera ves esta </w:t>
-      </w:r>
-      <w:proofErr w:type="spellStart"/>
-      <w:proofErr w:type="gramStart"/>
+        <w:t xml:space="preserve">4. MIS LIGAS al ingresar por primera </w:t>
+      </w:r>
+      <w:proofErr w:type="spellStart"/>
+      <w:r>
+        <w:t>ves</w:t>
+      </w:r>
+      <w:proofErr w:type="spellEnd"/>
+      <w:r>
+        <w:t xml:space="preserve"> esta </w:t>
+      </w:r>
+      <w:proofErr w:type="spellStart"/>
       <w:r>
         <w:t>asi</w:t>
       </w:r>
@@ -237,7 +223,6 @@
       <w:r>
         <w:t xml:space="preserve"> :</w:t>
       </w:r>
-      <w:proofErr w:type="gramEnd"/>
     </w:p>
     <w:p>
       <w:r>
@@ -284,15 +269,7 @@
     <w:p/>
     <w:p>
       <w:r>
-        <w:t xml:space="preserve">5. El siguiente lugar donde entraría como usuarios seria </w:t>
-      </w:r>
-      <w:proofErr w:type="gramStart"/>
-      <w:r>
-        <w:t>a  EXPLORAR</w:t>
-      </w:r>
-      <w:proofErr w:type="gramEnd"/>
-      <w:r>
-        <w:t xml:space="preserve"> LIGAS posiblemente</w:t>
+        <w:t>5. El siguiente lugar donde entraría como usuarios seria a  EXPLORAR LIGAS posiblemente</w:t>
       </w:r>
     </w:p>
     <w:p>
@@ -340,15 +317,7 @@
     </w:p>
     <w:p>
       <w:r>
-        <w:t xml:space="preserve">Aparece </w:t>
-      </w:r>
-      <w:proofErr w:type="gramStart"/>
-      <w:r>
-        <w:t>esto .</w:t>
-      </w:r>
-      <w:proofErr w:type="gramEnd"/>
-      <w:r>
-        <w:t xml:space="preserve"> En EXPLORAR COMPETENCIAS debería haber algún </w:t>
+        <w:t xml:space="preserve">Aparece esto . En EXPLORAR COMPETENCIAS debería haber algún </w:t>
       </w:r>
       <w:proofErr w:type="spellStart"/>
       <w:r>
@@ -364,15 +333,7 @@
       </w:r>
       <w:proofErr w:type="spellEnd"/>
       <w:r>
-        <w:t xml:space="preserve">. Por ejemplo. “Estas son las Competencias en las </w:t>
-      </w:r>
-      <w:proofErr w:type="gramStart"/>
-      <w:r>
-        <w:t>que  puede</w:t>
-      </w:r>
-      <w:proofErr w:type="gramEnd"/>
-      <w:r>
-        <w:t xml:space="preserve"> participar  y a partir de las cuales puede armar sus propias competencias entre amigo.”</w:t>
+        <w:t>. Por ejemplo. “Estas son las Competencias en las que  puede participar  y a partir de las cuales puede armar sus propias competencias entre amigo.”</w:t>
       </w:r>
     </w:p>
     <w:p>
@@ -419,16 +380,39 @@
     </w:p>
     <w:p/>
     <w:p>
-      <w:r>
-        <w:t xml:space="preserve">Ahí toque CREAR NUEVA </w:t>
-      </w:r>
-      <w:proofErr w:type="gramStart"/>
-      <w:r>
-        <w:t>LIGA ,</w:t>
-      </w:r>
-      <w:proofErr w:type="gramEnd"/>
-      <w:r>
-        <w:t xml:space="preserve"> y entro a esta pantalla</w:t>
+      <w:pPr>
+        <w:pBdr>
+          <w:bottom w:val="single" w:sz="6" w:space="1" w:color="auto"/>
+        </w:pBdr>
+      </w:pPr>
+      <w:r>
+        <w:t>Ahí toque CREAR NUEVA LIGA , y entro a esta pantalla</w:t>
+      </w:r>
+    </w:p>
+    <w:p>
+      <w:r>
+        <w:t xml:space="preserve">Ahora en MI CASA en MI PC … donde ya </w:t>
+      </w:r>
+      <w:proofErr w:type="spellStart"/>
+      <w:r>
+        <w:t>tenia</w:t>
+      </w:r>
+      <w:proofErr w:type="spellEnd"/>
+      <w:r>
+        <w:t xml:space="preserve"> cargada información se ve </w:t>
+      </w:r>
+      <w:proofErr w:type="spellStart"/>
+      <w:r>
+        <w:t>asi</w:t>
+      </w:r>
+      <w:proofErr w:type="spellEnd"/>
+      <w:r>
+        <w:t xml:space="preserve"> MIS LIGAS</w:t>
+      </w:r>
+    </w:p>
+    <w:p>
+      <w:r>
+        <w:t xml:space="preserve">Y esta bien ., Pero empezando de CERO con un usuario nunca llegue a poder tener en mis ligas las OFICIALES y las PROPIAS: </w:t>
       </w:r>
     </w:p>
     <w:p>
@@ -438,10 +422,10 @@
         </w:rPr>
         <w:lastRenderedPageBreak/>
         <w:drawing>
-          <wp:inline distT="0" distB="0" distL="0" distR="0" wp14:anchorId="07F23E26" wp14:editId="0203B6A1">
-            <wp:extent cx="5400040" cy="2875280"/>
-            <wp:effectExtent l="0" t="0" r="0" b="1270"/>
-            <wp:docPr id="7" name="Imagen 7"/>
+          <wp:inline distT="0" distB="0" distL="0" distR="0" wp14:anchorId="368FB69B" wp14:editId="0A1D5EFE">
+            <wp:extent cx="5400040" cy="3246755"/>
+            <wp:effectExtent l="0" t="0" r="0" b="0"/>
+            <wp:docPr id="1864716411" name="Imagen 1"/>
             <wp:cNvGraphicFramePr>
               <a:graphicFrameLocks xmlns:a="http://schemas.openxmlformats.org/drawingml/2006/main" noChangeAspect="1"/>
             </wp:cNvGraphicFramePr>
@@ -449,7 +433,7 @@
               <a:graphicData uri="http://schemas.openxmlformats.org/drawingml/2006/picture">
                 <pic:pic xmlns:pic="http://schemas.openxmlformats.org/drawingml/2006/picture">
                   <pic:nvPicPr>
-                    <pic:cNvPr id="1" name=""/>
+                    <pic:cNvPr id="1864716411" name=""/>
                     <pic:cNvPicPr/>
                   </pic:nvPicPr>
                   <pic:blipFill>
@@ -461,7 +445,7 @@
                   <pic:spPr>
                     <a:xfrm>
                       <a:off x="0" y="0"/>
-                      <a:ext cx="5400040" cy="2875280"/>
+                      <a:ext cx="5400040" cy="3246755"/>
                     </a:xfrm>
                     <a:prstGeom prst="rect">
                       <a:avLst/>
@@ -476,52 +460,14 @@
     </w:p>
     <w:p>
       <w:r>
-        <w:t xml:space="preserve">Pero no me queda CLARO si voy a crear una COMPETENCIA MIA entre amigos o una GENERAL (no debería poder un usuario </w:t>
-      </w:r>
-      <w:proofErr w:type="spellStart"/>
-      <w:r>
-        <w:t>comun</w:t>
-      </w:r>
-      <w:proofErr w:type="spellEnd"/>
-      <w:r>
-        <w:t xml:space="preserve">) </w:t>
-      </w:r>
-      <w:proofErr w:type="spellStart"/>
-      <w:r>
-        <w:t>Asi</w:t>
-      </w:r>
-      <w:proofErr w:type="spellEnd"/>
-      <w:r>
-        <w:t xml:space="preserve"> que habría que poner un </w:t>
-      </w:r>
-      <w:proofErr w:type="spellStart"/>
-      <w:r>
-        <w:t>label</w:t>
-      </w:r>
-      <w:proofErr w:type="spellEnd"/>
-      <w:r>
-        <w:t xml:space="preserve"> explicativo también (eso es regla general para TODAS las pantallas. Un </w:t>
-      </w:r>
-      <w:proofErr w:type="spellStart"/>
-      <w:r>
-        <w:t>label</w:t>
-      </w:r>
-      <w:proofErr w:type="spellEnd"/>
-      <w:r>
-        <w:t xml:space="preserve"> GUIA que diga donde esta y que puede hacer en esa parte del sistema)</w:t>
-      </w:r>
-    </w:p>
-    <w:p/>
-    <w:p>
-      <w:r>
         <w:rPr>
           <w:noProof/>
         </w:rPr>
         <w:drawing>
-          <wp:inline distT="0" distB="0" distL="0" distR="0" wp14:anchorId="1CCD8C9F" wp14:editId="5948C13B">
+          <wp:inline distT="0" distB="0" distL="0" distR="0" wp14:anchorId="07F23E26" wp14:editId="0203B6A1">
             <wp:extent cx="5400040" cy="2875280"/>
             <wp:effectExtent l="0" t="0" r="0" b="1270"/>
-            <wp:docPr id="8" name="Imagen 8"/>
+            <wp:docPr id="7" name="Imagen 7"/>
             <wp:cNvGraphicFramePr>
               <a:graphicFrameLocks xmlns:a="http://schemas.openxmlformats.org/drawingml/2006/main" noChangeAspect="1"/>
             </wp:cNvGraphicFramePr>
@@ -556,27 +502,42 @@
     </w:p>
     <w:p>
       <w:r>
-        <w:t xml:space="preserve">Fui a MIS LIGAS y sigue </w:t>
-      </w:r>
-      <w:proofErr w:type="spellStart"/>
-      <w:r>
-        <w:t>vacio</w:t>
-      </w:r>
-      <w:proofErr w:type="spellEnd"/>
-    </w:p>
-    <w:p>
-      <w:r>
-        <w:t xml:space="preserve">Pero me había creado la liga y me había dejado esta </w:t>
-      </w:r>
-      <w:proofErr w:type="gramStart"/>
-      <w:r>
-        <w:t>pantalla :</w:t>
-      </w:r>
-      <w:proofErr w:type="gramEnd"/>
-      <w:r>
-        <w:t xml:space="preserve"> </w:t>
-      </w:r>
-    </w:p>
+        <w:t xml:space="preserve">Pero no me queda CLARO si voy a crear una COMPETENCIA MIA entre amigos o una GENERAL (no debería poder un usuario </w:t>
+      </w:r>
+      <w:proofErr w:type="spellStart"/>
+      <w:r>
+        <w:t>comun</w:t>
+      </w:r>
+      <w:proofErr w:type="spellEnd"/>
+      <w:r>
+        <w:t xml:space="preserve">) </w:t>
+      </w:r>
+      <w:proofErr w:type="spellStart"/>
+      <w:r>
+        <w:t>Asi</w:t>
+      </w:r>
+      <w:proofErr w:type="spellEnd"/>
+      <w:r>
+        <w:t xml:space="preserve"> que habría que poner un </w:t>
+      </w:r>
+      <w:proofErr w:type="spellStart"/>
+      <w:r>
+        <w:t>label</w:t>
+      </w:r>
+      <w:proofErr w:type="spellEnd"/>
+      <w:r>
+        <w:t xml:space="preserve"> explicativo también (eso es regla general para TODAS las pantallas. Un </w:t>
+      </w:r>
+      <w:proofErr w:type="spellStart"/>
+      <w:r>
+        <w:t>label</w:t>
+      </w:r>
+      <w:proofErr w:type="spellEnd"/>
+      <w:r>
+        <w:t xml:space="preserve"> GUIA que diga donde esta y que puede hacer en esa parte del sistema)</w:t>
+      </w:r>
+    </w:p>
+    <w:p/>
     <w:p>
       <w:r>
         <w:rPr>
@@ -584,10 +545,10 @@
         </w:rPr>
         <w:lastRenderedPageBreak/>
         <w:drawing>
-          <wp:inline distT="0" distB="0" distL="0" distR="0" wp14:anchorId="1A7A08FE" wp14:editId="7B4413F8">
+          <wp:inline distT="0" distB="0" distL="0" distR="0" wp14:anchorId="1CCD8C9F" wp14:editId="5948C13B">
             <wp:extent cx="5400040" cy="2875280"/>
             <wp:effectExtent l="0" t="0" r="0" b="1270"/>
-            <wp:docPr id="9" name="Imagen 9"/>
+            <wp:docPr id="8" name="Imagen 8"/>
             <wp:cNvGraphicFramePr>
               <a:graphicFrameLocks xmlns:a="http://schemas.openxmlformats.org/drawingml/2006/main" noChangeAspect="1"/>
             </wp:cNvGraphicFramePr>
@@ -620,31 +581,19 @@
         </w:drawing>
       </w:r>
     </w:p>
-    <w:p/>
-    <w:p>
-      <w:r>
-        <w:t xml:space="preserve">Pero si </w:t>
-      </w:r>
-      <w:proofErr w:type="spellStart"/>
-      <w:r>
-        <w:t>voiy</w:t>
-      </w:r>
-      <w:proofErr w:type="spellEnd"/>
-      <w:r>
-        <w:t xml:space="preserve"> a mis ligas sigue </w:t>
-      </w:r>
-      <w:proofErr w:type="spellStart"/>
-      <w:proofErr w:type="gramStart"/>
-      <w:r>
-        <w:t>asi</w:t>
-      </w:r>
-      <w:proofErr w:type="spellEnd"/>
-      <w:r>
-        <w:t xml:space="preserve"> :</w:t>
-      </w:r>
-      <w:proofErr w:type="gramEnd"/>
-      <w:r>
-        <w:t xml:space="preserve"> </w:t>
+    <w:p>
+      <w:r>
+        <w:t xml:space="preserve">Fui a MIS LIGAS y sigue </w:t>
+      </w:r>
+      <w:proofErr w:type="spellStart"/>
+      <w:r>
+        <w:t>vacio</w:t>
+      </w:r>
+      <w:proofErr w:type="spellEnd"/>
+    </w:p>
+    <w:p>
+      <w:r>
+        <w:t xml:space="preserve">Pero me había creado la liga y me había dejado esta pantalla : </w:t>
       </w:r>
     </w:p>
     <w:p>
@@ -653,10 +602,10 @@
           <w:noProof/>
         </w:rPr>
         <w:drawing>
-          <wp:inline distT="0" distB="0" distL="0" distR="0" wp14:anchorId="1CB13CD6" wp14:editId="042A4CE8">
+          <wp:inline distT="0" distB="0" distL="0" distR="0" wp14:anchorId="1A7A08FE" wp14:editId="7B4413F8">
             <wp:extent cx="5400040" cy="2875280"/>
             <wp:effectExtent l="0" t="0" r="0" b="1270"/>
-            <wp:docPr id="10" name="Imagen 10"/>
+            <wp:docPr id="9" name="Imagen 9"/>
             <wp:cNvGraphicFramePr>
               <a:graphicFrameLocks xmlns:a="http://schemas.openxmlformats.org/drawingml/2006/main" noChangeAspect="1"/>
             </wp:cNvGraphicFramePr>
@@ -690,6 +639,71 @@
       </w:r>
     </w:p>
     <w:p/>
+    <w:p>
+      <w:r>
+        <w:t xml:space="preserve">Pero si </w:t>
+      </w:r>
+      <w:proofErr w:type="spellStart"/>
+      <w:r>
+        <w:t>voiy</w:t>
+      </w:r>
+      <w:proofErr w:type="spellEnd"/>
+      <w:r>
+        <w:t xml:space="preserve"> a mis ligas sigue </w:t>
+      </w:r>
+      <w:proofErr w:type="spellStart"/>
+      <w:r>
+        <w:t>asi</w:t>
+      </w:r>
+      <w:proofErr w:type="spellEnd"/>
+      <w:r>
+        <w:t xml:space="preserve"> : </w:t>
+      </w:r>
+    </w:p>
+    <w:p>
+      <w:r>
+        <w:rPr>
+          <w:noProof/>
+        </w:rPr>
+        <w:lastRenderedPageBreak/>
+        <w:drawing>
+          <wp:inline distT="0" distB="0" distL="0" distR="0" wp14:anchorId="1CB13CD6" wp14:editId="042A4CE8">
+            <wp:extent cx="5400040" cy="2875280"/>
+            <wp:effectExtent l="0" t="0" r="0" b="1270"/>
+            <wp:docPr id="10" name="Imagen 10"/>
+            <wp:cNvGraphicFramePr>
+              <a:graphicFrameLocks xmlns:a="http://schemas.openxmlformats.org/drawingml/2006/main" noChangeAspect="1"/>
+            </wp:cNvGraphicFramePr>
+            <a:graphic xmlns:a="http://schemas.openxmlformats.org/drawingml/2006/main">
+              <a:graphicData uri="http://schemas.openxmlformats.org/drawingml/2006/picture">
+                <pic:pic xmlns:pic="http://schemas.openxmlformats.org/drawingml/2006/picture">
+                  <pic:nvPicPr>
+                    <pic:cNvPr id="1" name=""/>
+                    <pic:cNvPicPr/>
+                  </pic:nvPicPr>
+                  <pic:blipFill>
+                    <a:blip r:embed="rId14"/>
+                    <a:stretch>
+                      <a:fillRect/>
+                    </a:stretch>
+                  </pic:blipFill>
+                  <pic:spPr>
+                    <a:xfrm>
+                      <a:off x="0" y="0"/>
+                      <a:ext cx="5400040" cy="2875280"/>
+                    </a:xfrm>
+                    <a:prstGeom prst="rect">
+                      <a:avLst/>
+                    </a:prstGeom>
+                  </pic:spPr>
+                </pic:pic>
+              </a:graphicData>
+            </a:graphic>
+          </wp:inline>
+        </w:drawing>
+      </w:r>
+    </w:p>
+    <w:p/>
     <w:sectPr>
       <w:pgSz w:w="11906" w:h="16838"/>
       <w:pgMar w:top="1417" w:right="1701" w:bottom="1417" w:left="1701" w:header="708" w:footer="708" w:gutter="0"/>
@@ -701,7 +715,7 @@
 </file>
 
 <file path=word/styles.xml><?xml version="1.0" encoding="utf-8"?>
-<w:styles xmlns:mc="http://schemas.openxmlformats.org/markup-compatibility/2006" xmlns:r="http://schemas.openxmlformats.org/officeDocument/2006/relationships" xmlns:w="http://schemas.openxmlformats.org/wordprocessingml/2006/main" xmlns:w14="http://schemas.microsoft.com/office/word/2010/wordml" xmlns:w15="http://schemas.microsoft.com/office/word/2012/wordml" xmlns:w16cex="http://schemas.microsoft.com/office/word/2018/wordml/cex" xmlns:w16cid="http://schemas.microsoft.com/office/word/2016/wordml/cid" xmlns:w16="http://schemas.microsoft.com/office/word/2018/wordml" xmlns:w16sdtdh="http://schemas.microsoft.com/office/word/2020/wordml/sdtdatahash" xmlns:w16se="http://schemas.microsoft.com/office/word/2015/wordml/symex" mc:Ignorable="w14 w15 w16se w16cid w16 w16cex w16sdtdh">
+<w:styles xmlns:mc="http://schemas.openxmlformats.org/markup-compatibility/2006" xmlns:r="http://schemas.openxmlformats.org/officeDocument/2006/relationships" xmlns:w="http://schemas.openxmlformats.org/wordprocessingml/2006/main" xmlns:w14="http://schemas.microsoft.com/office/word/2010/wordml" xmlns:w15="http://schemas.microsoft.com/office/word/2012/wordml" xmlns:w16cex="http://schemas.microsoft.com/office/word/2018/wordml/cex" xmlns:w16cid="http://schemas.microsoft.com/office/word/2016/wordml/cid" xmlns:w16="http://schemas.microsoft.com/office/word/2018/wordml" xmlns:w16du="http://schemas.microsoft.com/office/word/2023/wordml/word16du" xmlns:w16sdtdh="http://schemas.microsoft.com/office/word/2020/wordml/sdtdatahash" xmlns:w16se="http://schemas.microsoft.com/office/word/2015/wordml/symex" mc:Ignorable="w14 w15 w16se w16cid w16 w16cex w16sdtdh w16du">
   <w:docDefaults>
     <w:rPrDefault>
       <w:rPr>

</xml_diff>